<commit_message>
fix(diagnóstico): ejemplo Formatos a SOLO componentes observados (angosto) — causa del corte
Con triage/tendencia ya OK en Sonnet, el diagnóstico seguía sin renderizar: el SQL y
datos eran correctos (2 comp. observados, NumCompTotal/Obs), pero el EJEMPLO en Formatos
mostraba la matriz de 6 columnas (los 6 componentes) → el central imitaba el ejemplo y
pintaba 6 columnas anchas → se cortaba. El ejemplo contradecía la regla «default solo
observados». Fix: ejemplo reescrito a 2 columnas (solo MT LH + Hidr. observados), 1:1 con
el shape real del SELECT; regla reforzada «COLUMNAS = solo observados (1-3), NUNCA los 6».
Solo conocimiento → re-subir Formatos (no requiere DDL).

Co-Authored-By: Claude Opus 4.8 <noreply@anthropic.com>
</commit_message>
<xml_diff>
--- a/docs/copilot/knowledge/Formatos_de_Respuesta.docx
+++ b/docs/copilot/knowledge/Formatos_de_Respuesta.docx
@@ -1389,7 +1389,7 @@
           <w:color w:val="1A1A1A"/>
           <w:sz w:val="17"/>
         </w:rPr>
-        <w:t>|---|---|---|---|---|---|---|</w:t>
+        <w:t>|---|---|---|</w:t>
       </w:r>
     </w:p>
     <w:p>
@@ -2965,7 +2965,7 @@
           <w:rFonts w:ascii="Consolas" w:hAnsi="Consolas"/>
           <w:sz w:val="17"/>
         </w:rPr>
-        <w:t>Reglas: cada celda = valor con chip pegado (🟥 &gt; LC, 🟨 &gt; LP, 🟩 se deja limpio); «—» si el parámetro NO es relevante para ese componente o no hay dato. Muestra SOLO los params relevantes por componente — MT: Fe,PQ,Cr,Ni,Cu,Pb,Sn,Al,Si,Ca,Zn,K,B,P,Mg,V100,TBN · Hidráulico: Fe,Si,Cu,Al · Rueda Del.: Fe,PQ,Ni,Cu · Motor: Fe,Cu,Al,TBN. Informativos (Ca/Zn/K/Mg) con sufijo «inf». ⛔ NO columnas LP/LC (el chip ya da el estado). Ordena componentes lógicamente (MT LH/RH, Rueda LH/RH, Motor, Hidr.). Componentes sin nombre (NULL) NO van. ⛔ ANTI-CORTE (la tabla completa es muy grande y se corta): POR DEFECTO muestra SOLO las filas de parámetros con ≥1 valor fuera de límite (🟥/🟨) en algún componente, más «Fec./Hor.Comp./CM/Est.Gen.»; OMITE las filas OK en TODOS los componentes y cierra con «(+N parámetros dentro de límite — pide 'todos los metales')». ADEMÁS por COMPONENTES: el SELECT por defecto trae SOLO componentes observados (Estado≠OK) → muestra esas columnas + línea «resto: N comp. en OK»; SOLO «todos/completo» trae TODOS los componentes y parámetros (panel completo). UNA sola tabla ancha (⛔ NO secciones separadas por componente), info general compacta (Mod./Eqp., Hor., Fec., Est.Gen.), recomendaciones breves.</w:t>
+        <w:t>Reglas: cada celda = valor con chip pegado (🟥 &gt; LC, 🟨 &gt; LP, 🟩 se deja limpio); «—» si el parámetro NO es relevante para ese componente o no hay dato. Muestra SOLO los params relevantes por componente — MT: Fe,PQ,Cr,Ni,Cu,Pb,Sn,Al,Si,Ca,Zn,K,B,P,Mg,V100,TBN · Hidráulico: Fe,Si,Cu,Al · Rueda Del.: Fe,PQ,Ni,Cu · Motor: Fe,Cu,Al,TBN. Informativos (Ca/Zn/K/Mg) con sufijo «inf». ⛔ NO columnas LP/LC (el chip ya da el estado). Ordena componentes lógicamente (MT LH/RH, Rueda LH/RH, Motor, Hidr.). Componentes sin nombre (NULL) NO van. ⛔ ANTI-CORTE (la tabla completa es muy grande y se corta): POR DEFECTO muestra SOLO las filas de parámetros con ≥1 valor fuera de límite (🟥/🟨) en algún componente, más «Fec./Hor.Comp./CM/Est.Gen.»; OMITE las filas OK en TODOS los componentes y cierra con «(+N parámetros dentro de límite — pide 'todos los metales')». ADEMÁS por COMPONENTES: el SELECT por defecto trae SOLO componentes observados (Estado≠OK) → muestra esas columnas + línea «resto: N comp. en OK»; SOLO «todos/completo» trae TODOS los componentes y parámetros (panel completo). UNA sola tabla (⛔ NO secciones separadas por componente), info compacta, recomendaciones breves. ⛔ COLUMNAS = SOLO los componentes OBSERVADOS que trae el SELECT (típico 1-3); NUNCA los 6 — la tabla de 6 columnas es la que SE CORTA. «X de N» con NumCompObs/NumCompTotal.</w:t>
       </w:r>
     </w:p>
     <w:p>
@@ -2975,7 +2975,7 @@
           <w:rFonts w:ascii="Consolas" w:hAnsi="Consolas"/>
           <w:sz w:val="17"/>
         </w:rPr>
-        <w:t>Diagnóstico del CA3177 (Antapaccay) — 3 de 6 compartimientos observados; fecha más reciente 08-Jun.</w:t>
+        <w:t>Diagnóstico del CA3177 (Antapaccay) — 2 de 6 compartimientos observados (el resto, dentro de límite).</w:t>
       </w:r>
     </w:p>
     <w:p>
@@ -3035,7 +3035,7 @@
           <w:rFonts w:ascii="Consolas" w:hAnsi="Consolas"/>
           <w:sz w:val="17"/>
         </w:rPr>
-        <w:t>| Hor. | 35 511 |</w:t>
+        <w:t>| Hor. | 34 929 |</w:t>
       </w:r>
     </w:p>
     <w:p>
@@ -3045,7 +3045,7 @@
           <w:rFonts w:ascii="Consolas" w:hAnsi="Consolas"/>
           <w:sz w:val="17"/>
         </w:rPr>
-        <w:t>| Fec. más reciente | 08-Jun |</w:t>
+        <w:t>| Fec. | 22-Jun |</w:t>
       </w:r>
     </w:p>
     <w:p>
@@ -3055,7 +3055,7 @@
           <w:rFonts w:ascii="Consolas" w:hAnsi="Consolas"/>
           <w:sz w:val="17"/>
         </w:rPr>
-        <w:t>| Est. Gen. | 🟥 (peor: MT LH) |</w:t>
+        <w:t>| Est. Gen. | 🟥 (peor: Hidr.) |</w:t>
       </w:r>
     </w:p>
     <w:p>
@@ -3085,7 +3085,7 @@
           <w:rFonts w:ascii="Consolas" w:hAnsi="Consolas"/>
           <w:sz w:val="17"/>
         </w:rPr>
-        <w:t>| Par. | MT LH | MT RH | Rda LH | Rda RH | Motor | Hidr. |</w:t>
+        <w:t>| Par. | MT LH | Hidr. |</w:t>
       </w:r>
     </w:p>
     <w:p>
@@ -3105,7 +3105,7 @@
           <w:rFonts w:ascii="Consolas" w:hAnsi="Consolas"/>
           <w:sz w:val="17"/>
         </w:rPr>
-        <w:t>| Fec. U.A. | 29-May | 04-Jun | 03-Jun | 03-Jun | 08-Jun | 29-May |</w:t>
+        <w:t>| Fec. U.A. | 22-Jun | 22-Jun |</w:t>
       </w:r>
     </w:p>
     <w:p>
@@ -3115,7 +3115,7 @@
           <w:rFonts w:ascii="Consolas" w:hAnsi="Consolas"/>
           <w:sz w:val="17"/>
         </w:rPr>
-        <w:t>| Hor. Comp. | 97 | 8 721 | 2 729 | 12 253 | 9 558 | 34 511 |</w:t>
+        <w:t>| Hor. Comp. | 515 | 2 389 |</w:t>
       </w:r>
     </w:p>
     <w:p>
@@ -3125,7 +3125,7 @@
           <w:rFonts w:ascii="Consolas" w:hAnsi="Consolas"/>
           <w:sz w:val="17"/>
         </w:rPr>
-        <w:t>| CM | ADI | M | M | M | M | M |</w:t>
+        <w:t>| CM | PrePM | PrePM |</w:t>
       </w:r>
     </w:p>
     <w:p>
@@ -3135,7 +3135,7 @@
           <w:rFonts w:ascii="Consolas" w:hAnsi="Consolas"/>
           <w:sz w:val="17"/>
         </w:rPr>
-        <w:t>| **Met. Desg.** | | | | | | |</w:t>
+        <w:t>| **Met. Desg.** | | |</w:t>
       </w:r>
     </w:p>
     <w:p>
@@ -3145,7 +3145,7 @@
           <w:rFonts w:ascii="Consolas" w:hAnsi="Consolas"/>
           <w:sz w:val="17"/>
         </w:rPr>
-        <w:t>| Fe | 146 | 60 | 36 🟨 | 12 | 8 | 3 |</w:t>
+        <w:t>| Fe | 229.8 🟨 | — |</w:t>
       </w:r>
     </w:p>
     <w:p>
@@ -3155,7 +3155,7 @@
           <w:rFonts w:ascii="Consolas" w:hAnsi="Consolas"/>
           <w:sz w:val="17"/>
         </w:rPr>
-        <w:t>| PQ | 201 🟥 | 45 | 22 | 10 | — | — |</w:t>
+        <w:t>| PQ | 133.2 🟨 | — |</w:t>
       </w:r>
     </w:p>
     <w:p>
@@ -3165,7 +3165,7 @@
           <w:rFonts w:ascii="Consolas" w:hAnsi="Consolas"/>
           <w:sz w:val="17"/>
         </w:rPr>
-        <w:t>| Cr | 1.7 | 1.2 | — | — | — | — |</w:t>
+        <w:t>| Cr | 4.2 🟥 | — |</w:t>
       </w:r>
     </w:p>
     <w:p>
@@ -3175,7 +3175,7 @@
           <w:rFonts w:ascii="Consolas" w:hAnsi="Consolas"/>
           <w:sz w:val="17"/>
         </w:rPr>
-        <w:t>| Cu | 6.0 | 0.9 | 0.5 | 0.3 | 0.0 | 5.1 🟥 |</w:t>
+        <w:t>| Ni | 2.2 🟨 | — |</w:t>
       </w:r>
     </w:p>
     <w:p>
@@ -3185,7 +3185,7 @@
           <w:rFonts w:ascii="Consolas" w:hAnsi="Consolas"/>
           <w:sz w:val="17"/>
         </w:rPr>
-        <w:t>| Al | 0.3 | 0.1 | — | — | 0.0 | 0.2 |</w:t>
+        <w:t>| Pb | 5.2 🟥 | — |</w:t>
       </w:r>
     </w:p>
     <w:p>
@@ -3195,7 +3195,7 @@
           <w:rFonts w:ascii="Consolas" w:hAnsi="Consolas"/>
           <w:sz w:val="17"/>
         </w:rPr>
-        <w:t>| **Contam.** | | | | | | |</w:t>
+        <w:t>| Cu | — | 5.2 🟥 |</w:t>
       </w:r>
     </w:p>
     <w:p>
@@ -3205,7 +3205,7 @@
           <w:rFonts w:ascii="Consolas" w:hAnsi="Consolas"/>
           <w:sz w:val="17"/>
         </w:rPr>
-        <w:t>| Si | 15 | 20 | — | — | — | 12 |</w:t>
+        <w:t>| **Contam. (informativos)** | | |</w:t>
       </w:r>
     </w:p>
     <w:p>
@@ -3215,7 +3215,7 @@
           <w:rFonts w:ascii="Consolas" w:hAnsi="Consolas"/>
           <w:sz w:val="17"/>
         </w:rPr>
-        <w:t>| Zn | 1 396 🟥 inf | — | — | — | — | — |</w:t>
+        <w:t>| Ca | 15.7 inf | 2 796 🟥 inf |</w:t>
       </w:r>
     </w:p>
     <w:p>
@@ -3225,7 +3225,7 @@
           <w:rFonts w:ascii="Consolas" w:hAnsi="Consolas"/>
           <w:sz w:val="17"/>
         </w:rPr>
-        <w:t>| **Salud** | | | | | | |</w:t>
+        <w:t>| Zn | 20.7 inf | 1 290 🟥 inf |</w:t>
       </w:r>
     </w:p>
     <w:p>
@@ -3235,7 +3235,7 @@
           <w:rFonts w:ascii="Consolas" w:hAnsi="Consolas"/>
           <w:sz w:val="17"/>
         </w:rPr>
-        <w:t>| TBN | 3.5 | 3.6 | — | — | 3.2 🟨 | — |</w:t>
+        <w:t>| Mg | — | 18.3 🟥 inf |</w:t>
       </w:r>
     </w:p>
     <w:p>

</xml_diff>

<commit_message>
fix(grafico): ASCII de tendencia legible — componente relevante + eje Y=valor
Marcha: "tendencia Cu CA3165" bien, pero "dame el gráfico" salió mal: charteó
MT LH (Cu ~0.2, plano) en vez del Motor (crítico 4.0→6.8) y usó el nº de
muestra como eje Y (6|×0.3, 5|×0.2…) → ilegible.

- Formatos (conocimiento): bloque "CÓMO CONSTRUIR EL GRÁFICO ASCII" — 5 pasos:
  (1) componente MÁS RELEVANTE (⛔ no plano ~0; ej. Cu CA3165→Motor, no MT LH),
  (2) eje Y = VALOR (⛔ no nº de muestra) escalado 0..>máx/LC,
  (3) eje X = fechas cronológicas, (4) LP/LC líneas punteadas, (5) una serie.
- central: regla (3) reforzada — "gráfico del comp. MÁS RELEVANTE (⛔ no plano;
  eje Y=VALOR, X=fechas, LP/LC)", aplica en PASO 2 y tendencia de un metal.

Auditoría cruzada OK: central 7946, SQL 7964 (<8000); gráfico coherente
central↔Formatos; apodos coherente SQL↔Esquema.

Co-Authored-By: Claude Opus 4.8 <noreply@anthropic.com>
</commit_message>
<xml_diff>
--- a/docs/copilot/knowledge/Formatos_de_Respuesta.docx
+++ b/docs/copilot/knowledge/Formatos_de_Respuesta.docx
@@ -2546,6 +2546,11 @@
           <w:sz w:val="17"/>
         </w:rPr>
         <w:t>📈 Tendencia registrada según muestras disponibles.</w:t>
+      </w:r>
+    </w:p>
+    <w:p>
+      <w:r>
+        <w:t>CÓMO CONSTRUIR EL GRÁFICO ASCII (tendencia) — pasos OBLIGATORIOS para que salga LEGIBLE (el gráfico importa; si no puede salir bien inline, OFRÉCELO y constrúyelo bien al pedirlo): 1) COMPONENTE = el MÁS RELEVANTE = el de valores más altos / con críticos (EsRelevante=1). ⛔ NUNCA grafiques un componente plano en ~0 (ej.: Cu del CA3165 → grafica el MOTOR 4.0→6.8, ⛔ NO MT LH ~0.2). 2) EJE Y = el VALOR del metal (⛔ NO el nº de muestra): toma ~6 niveles entre 0 y un poco por encima del máximo (y por encima de LC); cada muestra es un punto en la FILA del nivel más cercano a su valor (un valor 6.8 va arriba, un 0.6 va abajo). 3) EJE X = las fechas en orden cronológico izq→der, una columna por muestra. 4) LP y LC = líneas horizontales punteadas en su nivel Y, rotuladas «LP»/«LC» a la derecha. 5) UNA sola serie (un componente), ancho compacto, encabezado «&lt;Metal&gt; (&lt;Comp&gt;) — ppm». El gráfico aplica en PASO 2 de tendencia y cuando pidan «gráfico» en tendencia de un metal (del componente relevante). Sigue el modelo ASCII de arriba (valor en Y, fechas en X, líneas LP/LC).</w:t>
       </w:r>
     </w:p>
     <w:p>

</xml_diff>

<commit_message>
feat(barrido): matriz por componente (filas=equipo × cols=componente) para flota grande
Pedido de gerencia 2026-07-10: el barrido de muchos equipos (Antamina 53+) se lee
mejor como MATRIZ equipo×componente que como tabla consolidada 1-fila-por-componente.
- Formatos caso (A): reescrito a MATRIZ POR COMPONENTE — filas=equipo, columnas=comp.
  observados abreviados (MT LH/RH, RD LH/RH, Motor, SH), celda=metales determinantes
  con chip (críticos 1º; — si OK); omite columnas sin observados; informativos al pie.
- central: regla (A) actualizada a la matriz (apunta a «Formatos»); trim redundancia. 7984.
- Sin DDL (usa vw_ObservadosDetalle). Menos payload que la consolidada → ayuda latencia Antamina.

Co-Authored-By: Claude Opus 4.8 <noreply@anthropic.com>
</commit_message>
<xml_diff>
--- a/docs/copilot/knowledge/Formatos_de_Respuesta.docx
+++ b/docs/copilot/knowledge/Formatos_de_Respuesta.docx
@@ -3525,7 +3525,7 @@
           <w:color w:val="1A1A1A"/>
           <w:sz w:val="17"/>
         </w:rPr>
-        <w:t>PASO 2 — DETALLE (follow-up «detalle / detalle completo / detalle de todos / de un equipo»). Adapta el formato al ALCANCE (según para qué se pide): (A) TODOS los observados o MUCHOS (más de ~6 equipos) → UNA TABLA CONSOLIDADA (ejemplo (A) abajo): una fila por equipo·componente; ⛔ NO 25 matrices (no caben en un mensaje y el modelo se corta). (B) UN equipo, o POCOS equipos NOMBRADOS (≤6) → la MATRIZ compacta por equipo (formato Excel del área; ejemplo (B) abajo), título «CAxxxx (Comp. Observados) — Fec. dd-MMM». En AMBOS casos los valores llevan chip leído de la columna Detalle (':C'→🟥, ':P'→🟨, sufijo ' inf'→informativo Ca/Zn/K/Mg), críticos arriba; ⛔ NUNCA el esqueleto de 4 grupos (Met.Desg/Contam/Adit/Salud) de último análisis.</w:t>
+        <w:t>PASO 2 — DETALLE (follow-up «detalle / detalle completo / detalle de todos / de un equipo»). Adapta el formato al ALCANCE (según para qué se pide): (A) TODOS los observados o MUCHOS (más de ~6 equipos) → UNA MATRIZ POR COMPONENTE (ejemplo (A) abajo): filas=equipo, columnas=componentes observados (abrev.), celda=metales de ese comp.; ⛔ NO 25 matrices por-equipo (no caben y el modelo se corta). (B) UN equipo, o POCOS equipos NOMBRADOS (≤6) → la MATRIZ compacta por equipo (formato Excel del área; ejemplo (B) abajo), título «CAxxxx (Comp. Observados) — Fec. dd-MMM». En AMBOS casos los valores llevan chip leído de la columna Detalle (':C'→🟥, ':P'→🟨, sufijo ' inf'→informativo Ca/Zn/K/Mg), críticos arriba; ⛔ NUNCA el esqueleto de 4 grupos (Met.Desg/Contam/Adit/Salud) de último análisis.</w:t>
       </w:r>
     </w:p>
     <w:p>
@@ -3554,7 +3554,7 @@
           <w:color w:val="1A1A1A"/>
           <w:sz w:val="17"/>
         </w:rPr>
-        <w:t>(A) TODOS / MUCHOS (&gt;6 equipos) → TABLA CONSOLIDADA — una fila por equipo·componente observado; valores con chip desde Detalle; críticos arriba. NO matrices:</w:t>
+        <w:t>(A) TODOS / MUCHOS (&gt;6 equipos) → MATRIZ POR COMPONENTE — filas=EQUIPO, columnas=los COMPONENTES observados (abrevia: MT LH, MT RH, RD LH, RD RH, Motor, SH; en ese orden). Celda = los metales DETERMINANTES de ESE componente en ese equipo, con chip desde Detalle (críticos 1º); «—» si ese componente está OK o sin muestra. OMITE toda columna de componente que NO tenga ningún observado en la flota. Los informativos (Ca/Zn/K/Mg, ' inf') NO van en la celda: se resumen al pie. Ideal para el barrido (vista rápida de qué componente de qué camión por qué metal):</w:t>
       </w:r>
     </w:p>
     <w:p>
@@ -3566,7 +3566,7 @@
           <w:color w:val="1A1A1A"/>
           <w:sz w:val="17"/>
         </w:rPr>
-        <w:t>Detalle — flota 980E Antapaccay: SOLO componentes con ≥1 crítico (NumCrit&gt;0); los de solo precaución se resumen al pie «(+N en precaución — pide 'precauciones')». Críticos arriba.</w:t>
+        <w:t>Detalle — flota 980E Antamina (matriz por componente): SOLO equipos con ≥1 crítico (NumCrit&gt;0); los de solo precaución se resumen al pie «(+N en precaución — pide 'precauciones')». Equipos con más críticos arriba.</w:t>
       </w:r>
     </w:p>
     <w:p>
@@ -3578,7 +3578,7 @@
           <w:color w:val="1A1A1A"/>
           <w:sz w:val="17"/>
         </w:rPr>
-        <w:t>| Eqp. | Comp. | Fec. | Hor. Comp. | Parámetros fuera de límite |</w:t>
+        <w:t>| Eqp. | MT LH | MT RH | RD LH | RD RH | Motor | SH |</w:t>
       </w:r>
     </w:p>
     <w:p>
@@ -3602,7 +3602,7 @@
           <w:color w:val="1A1A1A"/>
           <w:sz w:val="17"/>
         </w:rPr>
-        <w:t>| CAxxxx | Sist. Hidr. | 06-Jun | 41 689 | Cu 7.9 🟥 · Ca 2608 🟥 inf · Zn 1126 🟥 inf · Mg 15.5 🟥 inf |</w:t>
+        <w:t>| HT333 | Fe 🟥 | Cr 🟥 | Fe 🟨 | Fe 🟨 | — | Cu 🟥 · Si 🟨 |</w:t>
       </w:r>
     </w:p>
     <w:p>
@@ -3614,7 +3614,7 @@
           <w:color w:val="1A1A1A"/>
           <w:sz w:val="17"/>
         </w:rPr>
-        <w:t>| CAxxxx | Rueda Del. RH | 06-Jun | 15 407 | Fe 36.7 🟨 |</w:t>
+        <w:t>| HT308 | — | — | — | — | Na 🟥 | Cu 🟥 |</w:t>
       </w:r>
     </w:p>
     <w:p>
@@ -3626,7 +3626,7 @@
           <w:color w:val="1A1A1A"/>
           <w:sz w:val="17"/>
         </w:rPr>
-        <w:t>| CAxxxx | Sist. Hidr. | 05-Jun | 42 230 | Cu 11.9 🟥 · Sn 1.6 🟨 · Ca 4023 🟥 inf · Zn 1618 🟥 inf · Mg 17.7 🟥 inf |</w:t>
+        <w:t>| HT323 | Cr 🟥 | — | Fe 🟨 | — | — | Cu 🟥 |</w:t>
       </w:r>
     </w:p>
     <w:p>
@@ -3638,7 +3638,7 @@
           <w:color w:val="1A1A1A"/>
           <w:sz w:val="17"/>
         </w:rPr>
-        <w:t>| … | … | … | … | … |</w:t>
+        <w:t>| … | … | … | … | … | … | … |</w:t>
       </w:r>
     </w:p>
     <w:p>
@@ -3974,7 +3974,7 @@
           <w:rFonts w:ascii="Consolas" w:hAnsi="Consolas"/>
           <w:sz w:val="17"/>
         </w:rPr>
-        <w:t>|---|---|---|---|---|---|</w:t>
+        <w:t>|---|---|---|---|---|---|---|</w:t>
       </w:r>
     </w:p>
     <w:p>

</xml_diff>

<commit_message>
fix+doc: NL-as-SQL forbid en KomfIA_SQL + Detalle LP/LC en Formatos + org de encabezados
- KomfIA_SQL (P1): «Al flujo va SOLO el SELECT, NUNCA texto NL (=Incorrect syntax)» — el
  agente pasó el mensaje del usuario como SQL → «Incorrect syntax near 'cobre'». Compactada
  la cola de P1 para caber. 7969 (margen 31).
- Formatos: bloque «Valores y límites» y ejemplos actualizados a AMBOS límites (LP/LC), para
  precaución y crítico; corregida ref vieja 'Cu=24.2(LC4)'→'(LP3/LC4)'. Coherente con la vista.
- Org (seguro, texto 100% preservado): encabezado de tópico «EQUIPOS OBSERVADOS» y sub-header
  «TENDENCIA DE UN METAL» a negrita → los 6 tópicos ahora consistentes. 0 separadores rotos.

Co-Authored-By: Claude Opus 4.8 <noreply@anthropic.com>
</commit_message>
<xml_diff>
--- a/docs/copilot/knowledge/Formatos_de_Respuesta.docx
+++ b/docs/copilot/knowledge/Formatos_de_Respuesta.docx
@@ -2570,6 +2570,7 @@
       </w:pPr>
       <w:r>
         <w:rPr>
+          <w:b/>
           <w:sz w:val="19"/>
         </w:rPr>
         <w:t>TENDENCIA DE UN METAL (todos los componentes) — 1 FILA POR COMPONENTE (compacto, anti-corte) ⛔ FORMATO DISTINTO DEL HISTORIAL: aquí 1 fila por COMPONENTE con las fechas en COLUMNAS (matriz horizontal); NUNCA pongas las fechas en FILAS (eso es Historial). No cruces ambos formatos aunque los datos se parezcan.</w:t>
@@ -3284,6 +3285,7 @@
       <w:r>
         <w:rPr>
           <w:rFonts w:ascii="Consolas" w:hAnsi="Consolas"/>
+          <w:b/>
           <w:color w:val="1A1A1A"/>
           <w:sz w:val="17"/>
         </w:rPr>
@@ -3525,7 +3527,7 @@
           <w:color w:val="1A1A1A"/>
           <w:sz w:val="17"/>
         </w:rPr>
-        <w:t>PASO 2 — DETALLE (follow-up «detalle / detalle completo / detalle de todos / de un equipo»). Adapta el formato al ALCANCE (según para qué se pide): (A) TODOS los observados o MUCHOS (más de ~6 equipos) → UNA MATRIZ POR COMPONENTE (ejemplo (A) abajo): filas=equipo, columnas=componentes observados (abrev.), celda=metales de ese comp.; ⛔ NO 25 matrices por-equipo (no caben y el modelo se corta). (B) UN equipo, o POCOS equipos NOMBRADOS (≤6) → la MATRIZ compacta por equipo (formato Excel del área; ejemplo (B) abajo), título «CAxxxx (Comp. Observados) — Fec. dd-MMM». En AMBOS casos los valores llevan chip leído de la columna Detalle (':C'→🟥, ':P'→🟨, sufijo ' inf'→informativo Ca/Zn/K/Mg), críticos arriba; ⛔ NUNCA el esqueleto de 4 grupos (Met.Desg/Contam/Adit/Salud) de último análisis. NUEVO — «Valores y límites» (agrupado): tras la matriz, añade un bloque que AGRUPA por COMPONENTE → por METAL (con su límite UNA sola vez) → los equipos afectados con su valor+chip, leyendo value(LC/LP) de la columna Detalle (formato 'Cu=24.2(LC4):C'). Colapsa PATRONES SISTÉMICOS (mismo comp+metal en muchos equipos) en UNA línea con el conteo. La matriz da el panorama; este bloque da los VALORES y LÍMITES sin repetir el límite en cada celda. ⚡ VELOCIDAD (flota grande, ej. Antamina): si hay MUCHOS equipos (&gt;~15) o un patrón domina, LIDERA con este bloque agrupado y OFRECE la matriz/lista completa — ⛔ NO generes 50 filas de matriz de una (satura la generación y se corta); agrupar = menos texto y más claro.</w:t>
+        <w:t>PASO 2 — DETALLE (follow-up «detalle / detalle completo / detalle de todos / de un equipo»). Adapta el formato al ALCANCE (según para qué se pide): (A) TODOS los observados o MUCHOS (más de ~6 equipos) → UNA MATRIZ POR COMPONENTE (ejemplo (A) abajo): filas=equipo, columnas=componentes observados (abrev.), celda=metales de ese comp.; ⛔ NO 25 matrices por-equipo (no caben y el modelo se corta). (B) UN equipo, o POCOS equipos NOMBRADOS (≤6) → la MATRIZ compacta por equipo (formato Excel del área; ejemplo (B) abajo), título «CAxxxx (Comp. Observados) — Fec. dd-MMM». En AMBOS casos los valores llevan chip leído de la columna Detalle (':C'→🟥, ':P'→🟨, sufijo ' inf'→informativo Ca/Zn/K/Mg), críticos arriba; ⛔ NUNCA el esqueleto de 4 grupos (Met.Desg/Contam/Adit/Salud) de último análisis. NUEVO — «Valores y límites» (agrupado): tras la matriz, añade un bloque que AGRUPA por COMPONENTE → por METAL (con su límite UNA sola vez) → los equipos afectados con su valor+chip, leyendo value(LP/LC) de la columna Detalle (formato 'Cu=24.2(LP3/LC4):C'). Colapsa PATRONES SISTÉMICOS (mismo comp+metal en muchos equipos) en UNA línea con el conteo. La matriz da el panorama; este bloque da los VALORES y LÍMITES sin repetir el límite en cada celda. ⚡ VELOCIDAD (flota grande, ej. Antamina): si hay MUCHOS equipos (&gt;~15) o un patrón domina, LIDERA con este bloque agrupado y OFRECE la matriz/lista completa — ⛔ NO generes 50 filas de matriz de una (satura la generación y se corta); agrupar = menos texto y más claro.</w:t>
       </w:r>
     </w:p>
     <w:p>
@@ -3650,7 +3652,7 @@
           <w:color w:val="1A1A1A"/>
           <w:sz w:val="17"/>
         </w:rPr>
-        <w:t>Valores y límites (agrupado por componente → metal con su límite → equipos afectados; colapsa sistémicos):</w:t>
+        <w:t>Valores y límites (agrupado por componente → metal con AMBOS límites LP/LC → equipos afectados con valor+chip; SEA precaución o crítico; colapsa patrones sistémicos). Lee value(LP/LC) de la columna Detalle (formato 'Cu=7.9(LP4/LC6):C' — Pb/Sn/TBN solo LP):</w:t>
       </w:r>
     </w:p>
     <w:p>
@@ -3662,7 +3664,7 @@
           <w:color w:val="1A1A1A"/>
           <w:sz w:val="17"/>
         </w:rPr>
-        <w:t>MT LH · Fe (LC 230): HT333 245.0 🟥 · Cr (LC 3): HT323 4.1 🟥</w:t>
+        <w:t>MT LH · Fe (LP 200/LC 230): HT333 245.0 🟥 · Cr (LP 2/LC 3): HT323 4.1 🟥</w:t>
       </w:r>
     </w:p>
     <w:p>
@@ -3674,7 +3676,7 @@
           <w:color w:val="1A1A1A"/>
           <w:sz w:val="17"/>
         </w:rPr>
-        <w:t>Motor · Na (LC 4): HT308 6.1 🟥 (1 equipo)</w:t>
+        <w:t>Motor · Cu (LP 3/LC 3.5): HT308 3.8 🟥 (1 equipo)</w:t>
       </w:r>
     </w:p>
     <w:p>
@@ -3686,7 +3688,7 @@
           <w:color w:val="1A1A1A"/>
           <w:sz w:val="17"/>
         </w:rPr>
-        <w:t>Sist. Hidr. · Cu (LC 6): HT333 7.9 🟥 · HT308 5.2 🟨 · … (22 equipos — patrón sistémico)</w:t>
+        <w:t>Sist. Hidr. · Cu (LP 4/LC 6): HT333 7.9 🟥 · HT308 5.2 🟨 · … (22 equipos — patrón sistémico; el 🟨 es precaución = entre LP y LC)</w:t>
       </w:r>
     </w:p>
     <w:p>

</xml_diff>

<commit_message>
feat(barrido): cuadro de límites = matriz componente×metal (solo observados), sin ensanchar la matriz
Pedido (marcha 2026-07-14): en el barrido de flota faltaban los límites de los componentes.
Para no meter columnas de límite en cada celda de la matriz principal, se añade un CUADRO
APARTE: matriz componente (filas) × metal (columnas), celda = LP/LC, SOLO de los componentes
y metales que salieron observados (ej. MT LH, RD RH, Motor, Sist.Hidr.). Los límites varían
por componente (Cu: MT 10/15, SH 3/4, Motor 3/3.5) → por eso su propio cuadro. Se leen de la
columna Detalle ('Cu=24.2(LP3/LC4):C'), sin DDL. Reemplaza el bloque «Valores y límites»
agrupado; regla de velocidad actualizada (default críticos + resumen sistémico + ofrecer resto).
Solo Formatos; separadores 0 mismatch, matriz principal intacta.

Co-Authored-By: Claude Opus 4.8 <noreply@anthropic.com>
</commit_message>
<xml_diff>
--- a/docs/copilot/knowledge/Formatos_de_Respuesta.docx
+++ b/docs/copilot/knowledge/Formatos_de_Respuesta.docx
@@ -3527,7 +3527,7 @@
           <w:color w:val="1A1A1A"/>
           <w:sz w:val="17"/>
         </w:rPr>
-        <w:t>PASO 2 — DETALLE (follow-up «detalle / detalle completo / detalle de todos / de un equipo»). Adapta el formato al ALCANCE (según para qué se pide): (A) TODOS los observados o MUCHOS (más de ~6 equipos) → UNA MATRIZ POR COMPONENTE (ejemplo (A) abajo): filas=equipo, columnas=componentes observados (abrev.), celda=metales de ese comp.; ⛔ NO 25 matrices por-equipo (no caben y el modelo se corta). (B) UN equipo, o POCOS equipos NOMBRADOS (≤6) → la MATRIZ compacta por equipo (formato Excel del área; ejemplo (B) abajo), título «CAxxxx (Comp. Observados) — Fec. dd-MMM». En AMBOS casos los valores llevan chip leído de la columna Detalle (':C'→🟥, ':P'→🟨, sufijo ' inf'→informativo Ca/Zn/K/Mg), críticos arriba; ⛔ NUNCA el esqueleto de 4 grupos (Met.Desg/Contam/Adit/Salud) de último análisis. NUEVO — «Valores y límites» (agrupado): tras la matriz, añade un bloque que AGRUPA por COMPONENTE → por METAL (con su límite UNA sola vez) → los equipos afectados con su valor+chip, leyendo value(LP/LC) de la columna Detalle (formato 'Cu=24.2(LP3/LC4):C'). Colapsa PATRONES SISTÉMICOS (mismo comp+metal en muchos equipos) en UNA línea con el conteo. La matriz da el panorama; este bloque da los VALORES y LÍMITES sin repetir el límite en cada celda. ⚡ VELOCIDAD (flota grande, ej. Antamina): si hay MUCHOS equipos (&gt;~15) o un patrón domina, LIDERA con este bloque agrupado y OFRECE la matriz/lista completa — ⛔ NO generes 50 filas de matriz de una (satura la generación y se corta); agrupar = menos texto y más claro.</w:t>
+        <w:t>PASO 2 — DETALLE (follow-up «detalle / detalle completo / detalle de todos / de un equipo»). Adapta el formato al ALCANCE (según para qué se pide): (A) TODOS los observados o MUCHOS (más de ~6 equipos) → UNA MATRIZ POR COMPONENTE (ejemplo (A) abajo): filas=equipo, columnas=componentes observados (abrev.), celda=metales de ese comp.; ⛔ NO 25 matrices por-equipo (no caben y el modelo se corta). (B) UN equipo, o POCOS equipos NOMBRADOS (≤6) → la MATRIZ compacta por equipo (formato Excel del área; ejemplo (B) abajo), título «CAxxxx (Comp. Observados) — Fec. dd-MMM». En AMBOS casos los valores llevan chip leído de la columna Detalle (':C'→🟥, ':P'→🟨, sufijo ' inf'→informativo Ca/Zn/K/Mg), críticos arriba; ⛔ NUNCA el esqueleto de 4 grupos (Met.Desg/Contam/Adit/Salud) de último análisis. NUEVO — CUADRO DE LÍMITES (matriz componente×metal): tras la matriz/resumen, añade un cuadro APARTE con los LÍMITES (LP/LC) de SOLO los componentes y metales que salieron observados (filas=componente, columnas=metal, celda=«LP/LC», «—» si ese metal no salió en ese componente); léelos de la columna Detalle (formato 'Cu=24.2(LP3/LC4):C'). Los límites VARÍAN por componente (ej. Cu: MT 10/15, SH 3/4, Motor 3/3.5) → por eso van en su propio cuadro, no en cada celda. ⚡ VELOCIDAD (flota grande): default SOLO críticos + resume los patrones sistémicos (mismo comp+metal en muchos equipos) en 1 línea de texto + OFRECE el resto; ⛔ NO generes 50 filas de matriz de una (satura la generación).</w:t>
       </w:r>
     </w:p>
     <w:p>
@@ -3652,7 +3652,7 @@
           <w:color w:val="1A1A1A"/>
           <w:sz w:val="17"/>
         </w:rPr>
-        <w:t>Valores y límites (agrupado por componente → metal con AMBOS límites LP/LC → equipos afectados con valor+chip; SEA precaución o crítico; colapsa patrones sistémicos). Lee value(LP/LC) de la columna Detalle (formato 'Cu=7.9(LP4/LC6):C' — Pb/Sn/TBN solo LP):</w:t>
+        <w:t>Límites (LP/LC) de los componentes observados — CUADRO APARTE (matriz componente×metal), debajo de la matriz/resumen del barrido. Filas = SOLO los componentes que salieron observados; columnas = SOLO los metales que aparecieron; celda = «LP/LC» de ese componente-metal (varía por componente y proyecto); «—» si ese metal no salió en ese componente. Así se informan los límites sin ensanchar la matriz principal. Ej. (si el estudio arrojó MT LH, RD RH, Motor y Sist. Hidr.):</w:t>
       </w:r>
     </w:p>
     <w:p>
@@ -3664,7 +3664,7 @@
           <w:color w:val="1A1A1A"/>
           <w:sz w:val="17"/>
         </w:rPr>
-        <w:t>MT LH · Fe (LP 200/LC 230): HTxx1 245.0 🟥 · Cr (LP 2/LC 3): HTxx3 4.1 🟥</w:t>
+        <w:t>| Componente | Fe | Cr | Cu | Si | Zn |</w:t>
       </w:r>
     </w:p>
     <w:p>
@@ -3676,7 +3676,7 @@
           <w:color w:val="1A1A1A"/>
           <w:sz w:val="17"/>
         </w:rPr>
-        <w:t>Motor · Cu (LP 3/LC 3.5): HTxx2 3.8 🟥 (1 equipo)</w:t>
+        <w:t>|---|---|---|---|---|---|</w:t>
       </w:r>
     </w:p>
     <w:p>
@@ -3688,7 +3688,43 @@
           <w:color w:val="1A1A1A"/>
           <w:sz w:val="17"/>
         </w:rPr>
-        <w:t>Sist. Hidr. · Cu (LP 4/LC 6): HTxx1 7.9 🟥 · HTxx2 5.2 🟨 · … (22 equipos — patrón sistémico; el 🟨 es precaución = entre LP y LC)</w:t>
+        <w:t>| MT LH | 200/230 | 2/3 | 10/15 | 75/80 | 18/25 |</w:t>
+      </w:r>
+    </w:p>
+    <w:p>
+      <w:pPr/>
+      <w:r>
+        <w:rPr>
+          <w:rFonts w:ascii="Consolas" w:hAnsi="Consolas"/>
+          <w:b w:val="0"/>
+          <w:color w:val="1A1A1A"/>
+          <w:sz w:val="17"/>
+        </w:rPr>
+        <w:t>| RD RH | 32/40 | — | — | — | 18/25 |</w:t>
+      </w:r>
+    </w:p>
+    <w:p>
+      <w:pPr/>
+      <w:r>
+        <w:rPr>
+          <w:rFonts w:ascii="Consolas" w:hAnsi="Consolas"/>
+          <w:b w:val="0"/>
+          <w:color w:val="1A1A1A"/>
+          <w:sz w:val="17"/>
+        </w:rPr>
+        <w:t>| Motor | 14/16 | — | 3/3.5 | — | — |</w:t>
+      </w:r>
+    </w:p>
+    <w:p>
+      <w:pPr/>
+      <w:r>
+        <w:rPr>
+          <w:rFonts w:ascii="Consolas" w:hAnsi="Consolas"/>
+          <w:b w:val="0"/>
+          <w:color w:val="1A1A1A"/>
+          <w:sz w:val="17"/>
+        </w:rPr>
+        <w:t>| Sist. Hidr. | — | — | 3/4 | 75/80 | 18/25 |</w:t>
       </w:r>
     </w:p>
     <w:p>

</xml_diff>